<commit_message>
Fix -9998/AA and BYNOTAM ceilings, show FAA hours, add project notes
</commit_message>
<xml_diff>
--- a/UAS_Data_Sources.docx
+++ b/UAS_Data_Sources.docx
@@ -2310,7 +2310,7 @@
               <w:rPr>
                 <w:sz w:val="17"/>
               </w:rPr>
-              <w:t>Numeric top and bottom of the airspace.</w:t>
+              <w:t>Numeric top and bottom of the airspace. -9998 is a placeholder meaning the value is given by UPPER_DESC or UPPER_CODE instead (see below).</w:t>
             </w:r>
           </w:p>
         </w:tc>
@@ -2525,7 +2525,7 @@
               <w:rPr>
                 <w:sz w:val="17"/>
               </w:rPr>
-              <w:t>How the limit is applied: TI = "to and including", TNI = "to but not including", ANI = "above but not including" (codes as they appear in the data; FAA does not publish a legend in the service).</w:t>
+              <w:t>How the limit is applied: TI = "to and including", TNI = "to but not including". AA with UPPER_VAL -9998 = up to but not including Class A, i.e. below 18,000 ft MSL (4,203 Class Airspace records, most Class E). ANI appears on one record. UPPER_CODE BYNOTAM = ceiling set by NOTAM. (FAA does not publish a legend in the service.)</w:t>
             </w:r>
           </w:p>
         </w:tc>
@@ -2542,7 +2542,7 @@
               <w:rPr>
                 <w:sz w:val="17"/>
               </w:rPr>
-              <w:t>Kept in source_attrs</w:t>
+              <w:t>AA → ceiling 18,000 ft MSL; BYNOTAM → ceiling_ref NOTAM</w:t>
             </w:r>
           </w:p>
         </w:tc>
@@ -3847,7 +3847,7 @@
               <w:rPr>
                 <w:sz w:val="17"/>
               </w:rPr>
-              <w:t>Numeric top and bottom of the airspace.</w:t>
+              <w:t>Numeric top and bottom of the airspace. -9998 is a placeholder meaning the value is given by UPPER_DESC or UPPER_CODE instead (see below).</w:t>
             </w:r>
           </w:p>
         </w:tc>
@@ -4064,7 +4064,7 @@
               <w:rPr>
                 <w:sz w:val="17"/>
               </w:rPr>
-              <w:t>How the limit is applied: TI = "to and including", TNI = "to but not including", ANI = "above but not including" (codes as they appear in the data; FAA does not publish a legend in the service).</w:t>
+              <w:t>How the limit is applied: TI = "to and including", TNI = "to but not including". AA with UPPER_VAL -9998 = up to but not including Class A, i.e. below 18,000 ft MSL (4,203 Class Airspace records, most Class E). ANI appears on one record. UPPER_CODE BYNOTAM = ceiling set by NOTAM. (FAA does not publish a legend in the service.)</w:t>
             </w:r>
           </w:p>
         </w:tc>
@@ -4082,7 +4082,7 @@
               <w:rPr>
                 <w:sz w:val="17"/>
               </w:rPr>
-              <w:t>Kept in source_attrs</w:t>
+              <w:t>AA → ceiling 18,000 ft MSL; BYNOTAM → ceiling_ref NOTAM</w:t>
             </w:r>
           </w:p>
         </w:tc>

</xml_diff>